<commit_message>
Updated the contact details in the contact page
</commit_message>
<xml_diff>
--- a/documents/Mabuza_Themba_CV.docx
+++ b/documents/Mabuza_Themba_CV.docx
@@ -1182,35 +1182,81 @@
         </w:rPr>
         <w:t xml:space="preserve"> </w:t>
       </w:r>
-      <w:hyperlink r:id="rId9" w:history="1">
-        <w:r>
-          <w:rPr>
-            <w:rStyle w:val="Hyperlink"/>
-            <w:rFonts w:ascii="Bahnschrift Light Condensed" w:hAnsi="Bahnschrift Light Condensed"/>
-            <w:sz w:val="28"/>
-            <w:szCs w:val="28"/>
-          </w:rPr>
-          <w:t>Click</w:t>
-        </w:r>
-        <w:r>
-          <w:rPr>
-            <w:rStyle w:val="Hyperlink"/>
-            <w:rFonts w:ascii="Bahnschrift Light Condensed" w:hAnsi="Bahnschrift Light Condensed"/>
-            <w:sz w:val="28"/>
-            <w:szCs w:val="28"/>
-          </w:rPr>
-          <w:t xml:space="preserve"> </w:t>
-        </w:r>
-        <w:r>
-          <w:rPr>
-            <w:rStyle w:val="Hyperlink"/>
-            <w:rFonts w:ascii="Bahnschrift Light Condensed" w:hAnsi="Bahnschrift Light Condensed"/>
-            <w:sz w:val="28"/>
-            <w:szCs w:val="28"/>
-          </w:rPr>
-          <w:t>Me</w:t>
-        </w:r>
-      </w:hyperlink>
+      <w:r>
+        <w:rPr>
+          <w:rFonts w:ascii="Bahnschrift Light Condensed" w:hAnsi="Bahnschrift Light Condensed"/>
+          <w:sz w:val="28"/>
+          <w:szCs w:val="28"/>
+        </w:rPr>
+        <w:fldChar w:fldCharType="begin"/>
+      </w:r>
+      <w:r>
+        <w:rPr>
+          <w:rFonts w:ascii="Bahnschrift Light Condensed" w:hAnsi="Bahnschrift Light Condensed"/>
+          <w:sz w:val="28"/>
+          <w:szCs w:val="28"/>
+        </w:rPr>
+        <w:instrText>HYPERLINK "https://mabuza.netlify.app"</w:instrText>
+      </w:r>
+      <w:r>
+        <w:rPr>
+          <w:rFonts w:ascii="Bahnschrift Light Condensed" w:hAnsi="Bahnschrift Light Condensed"/>
+          <w:sz w:val="28"/>
+          <w:szCs w:val="28"/>
+        </w:rPr>
+      </w:r>
+      <w:r>
+        <w:rPr>
+          <w:rFonts w:ascii="Bahnschrift Light Condensed" w:hAnsi="Bahnschrift Light Condensed"/>
+          <w:sz w:val="28"/>
+          <w:szCs w:val="28"/>
+        </w:rPr>
+        <w:fldChar w:fldCharType="separate"/>
+      </w:r>
+      <w:r>
+        <w:rPr>
+          <w:rStyle w:val="Hyperlink"/>
+          <w:rFonts w:ascii="Bahnschrift Light Condensed" w:hAnsi="Bahnschrift Light Condensed"/>
+          <w:sz w:val="28"/>
+          <w:szCs w:val="28"/>
+        </w:rPr>
+        <w:t>Click</w:t>
+      </w:r>
+      <w:r>
+        <w:rPr>
+          <w:rStyle w:val="Hyperlink"/>
+          <w:rFonts w:ascii="Bahnschrift Light Condensed" w:hAnsi="Bahnschrift Light Condensed"/>
+          <w:sz w:val="28"/>
+          <w:szCs w:val="28"/>
+        </w:rPr>
+        <w:t xml:space="preserve"> </w:t>
+      </w:r>
+      <w:r>
+        <w:rPr>
+          <w:rStyle w:val="Hyperlink"/>
+          <w:rFonts w:ascii="Bahnschrift Light Condensed" w:hAnsi="Bahnschrift Light Condensed"/>
+          <w:sz w:val="28"/>
+          <w:szCs w:val="28"/>
+        </w:rPr>
+        <w:t>M</w:t>
+      </w:r>
+      <w:r>
+        <w:rPr>
+          <w:rStyle w:val="Hyperlink"/>
+          <w:rFonts w:ascii="Bahnschrift Light Condensed" w:hAnsi="Bahnschrift Light Condensed"/>
+          <w:sz w:val="28"/>
+          <w:szCs w:val="28"/>
+        </w:rPr>
+        <w:t>e</w:t>
+      </w:r>
+      <w:r>
+        <w:rPr>
+          <w:rFonts w:ascii="Bahnschrift Light Condensed" w:hAnsi="Bahnschrift Light Condensed"/>
+          <w:sz w:val="28"/>
+          <w:szCs w:val="28"/>
+        </w:rPr>
+        <w:fldChar w:fldCharType="end"/>
+      </w:r>
     </w:p>
     <w:p>
       <w:pPr>
@@ -2621,12 +2667,12 @@
       </w:pPr>
     </w:p>
     <w:sectPr>
-      <w:headerReference w:type="even" r:id="rId10"/>
-      <w:headerReference w:type="default" r:id="rId11"/>
-      <w:footerReference w:type="even" r:id="rId12"/>
-      <w:footerReference w:type="default" r:id="rId13"/>
-      <w:headerReference w:type="first" r:id="rId14"/>
-      <w:footerReference w:type="first" r:id="rId15"/>
+      <w:headerReference w:type="even" r:id="rId9"/>
+      <w:headerReference w:type="default" r:id="rId10"/>
+      <w:footerReference w:type="even" r:id="rId11"/>
+      <w:footerReference w:type="default" r:id="rId12"/>
+      <w:headerReference w:type="first" r:id="rId13"/>
+      <w:footerReference w:type="first" r:id="rId14"/>
       <w:pgSz w:w="12240" w:h="15840"/>
       <w:pgMar w:top="1440" w:right="1440" w:bottom="1440" w:left="1440" w:header="720" w:footer="720" w:gutter="0"/>
       <w:pgBorders w:offsetFrom="page">
@@ -4413,6 +4459,18 @@
       <w:shd w:val="clear" w:color="auto" w:fill="E1DFDD"/>
     </w:rPr>
   </w:style>
+  <w:style w:type="character" w:styleId="FollowedHyperlink">
+    <w:name w:val="FollowedHyperlink"/>
+    <w:basedOn w:val="DefaultParagraphFont"/>
+    <w:uiPriority w:val="99"/>
+    <w:semiHidden/>
+    <w:unhideWhenUsed/>
+    <w:rsid w:val="008A671B"/>
+    <w:rPr>
+      <w:color w:val="954F72" w:themeColor="followedHyperlink"/>
+      <w:u w:val="single"/>
+    </w:rPr>
+  </w:style>
 </w:styles>
 </file>
 

</xml_diff>